<commit_message>
Doc: add location privacy term
</commit_message>
<xml_diff>
--- a/src/screens/privacy/parke-terms/2026-10-21/Parke_개인정보처리방침_GPS개정.docx
+++ b/src/screens/privacy/parke-terms/2026-10-21/Parke_개인정보처리방침_GPS개정.docx
@@ -2132,7 +2132,7 @@
               <w:rPr>
                 <w:rFonts w:ascii="맑은 고딕" w:eastAsia="맑은 고딕" w:hAnsi="맑은 고딕" w:cs="맑은 고딕" w:hint="eastAsia"/>
               </w:rPr>
-              <w:t>휴대전화번호</w:t>
+              <w:t xml:space="preserve">휴대전화번호, 차량번호</w:t>
             </w:r>
           </w:p>
         </w:tc>
@@ -5079,34 +5079,8 @@
               <w:rPr>
                 <w:rFonts w:hint="eastAsia"/>
               </w:rPr>
-              <w:t>대한민국</w:t>
-            </w:r>
-            <w:r>
-              <w:rPr>
-                <w:rFonts w:hint="eastAsia"/>
-              </w:rPr>
-              <w:t xml:space="preserve"> </w:t>
-            </w:r>
-            <w:r>
-              <w:rPr>
-                <w:rFonts w:hint="eastAsia"/>
-              </w:rPr>
-              <w:t>서울</w:t>
-            </w:r>
-            <w:r>
-              <w:rPr>
-                <w:rFonts w:hint="eastAsia"/>
-              </w:rPr>
-              <w:t xml:space="preserve"> </w:t>
-            </w:r>
-            <w:proofErr w:type="spellStart"/>
-            <w:r>
-              <w:rPr>
-                <w:rFonts w:hint="eastAsia"/>
-              </w:rPr>
-              <w:t>리전</w:t>
-            </w:r>
-            <w:proofErr w:type="spellEnd"/>
+              <w:t xml:space="preserve">미국 (Firebase Authentication 및 Cloud Firestore, us-central1 리전)</w:t>
+            </w:r>
           </w:p>
         </w:tc>
       </w:tr>
@@ -5221,25 +5195,7 @@
               <w:rPr>
                 <w:rFonts w:ascii="맑은 고딕" w:eastAsia="맑은 고딕" w:hAnsi="맑은 고딕" w:cs="맑은 고딕" w:hint="eastAsia"/>
               </w:rPr>
-              <w:t>회원 정보(닉네임, 이메일</w:t>
-            </w:r>
-            <w:r>
-              <w:rPr>
-                <w:rFonts w:ascii="맑은 고딕" w:eastAsia="맑은 고딕" w:hAnsi="맑은 고딕" w:cs="맑은 고딕" w:hint="eastAsia"/>
-              </w:rPr>
-              <w:t xml:space="preserve">, </w:t>
-            </w:r>
-            <w:r>
-              <w:rPr>
-                <w:rFonts w:ascii="맑은 고딕" w:eastAsia="맑은 고딕" w:hAnsi="맑은 고딕" w:cs="맑은 고딕" w:hint="eastAsia"/>
-              </w:rPr>
-              <w:t>위치정보 및 주행 기록</w:t>
-            </w:r>
-            <w:r>
-              <w:rPr>
-                <w:rFonts w:ascii="맑은 고딕" w:eastAsia="맑은 고딕" w:hAnsi="맑은 고딕" w:cs="맑은 고딕" w:hint="eastAsia"/>
-              </w:rPr>
-              <w:t>)</w:t>
+              <w:t xml:space="preserve">회원 정보(닉네임, 이메일, 휴대전화번호, 차량번호), 위치정보 및 주행 기록</w:t>
             </w:r>
           </w:p>
         </w:tc>

</xml_diff>